<commit_message>
Trim bibliography to five scholarly entries
Removed the Multitracking the Spirit paper, the generic course
materials entry, and King et al. The remaining five sources are
the ones actually cited in the argument.

Made-with: Cursor
</commit_message>
<xml_diff>
--- a/I_Know_Who_I_Am_Full_Script.docx
+++ b/I_Know_Who_I_Am_Full_Script.docx
@@ -493,19 +493,6 @@
           <w:color w:val="1B1A18"/>
           <w:sz w:val="22"/>
         </w:rPr>
-        <w:t>Ajose, Toyin. “Multitracking the Spirit: Musicality, Prayer Chants and Pentecostal Spirituality in Nigeria.” Harvard Divinity School, 2025.</w:t>
-      </w:r>
-    </w:p>
-    <w:p>
-      <w:pPr>
-        <w:pStyle w:val="ListNumber"/>
-      </w:pPr>
-      <w:r>
-        <w:rPr>
-          <w:rFonts w:ascii="Calibri" w:hAnsi="Calibri" w:cs="Calibri"/>
-          <w:color w:val="1B1A18"/>
-          <w:sz w:val="22"/>
-        </w:rPr>
         <w:t>Ajose, Toyin Samuel. “Liturgical traditions and transitions: Congregational hymn singing in Nigerian Pentecostal churches.” Journal of the Association of Nigerian Musicologists, 2025.</w:t>
       </w:r>
     </w:p>
@@ -533,32 +520,6 @@
           <w:sz w:val="22"/>
         </w:rPr>
         <w:t>Ayodeji, Oluwafemi Emmanuel. Ecstasy, Holiness and Spiritual Warfare: Yorùbá Pentecostal Music Experience. Durham University, 2019.</w:t>
-      </w:r>
-    </w:p>
-    <w:p>
-      <w:pPr>
-        <w:pStyle w:val="ListNumber"/>
-      </w:pPr>
-      <w:r>
-        <w:rPr>
-          <w:rFonts w:ascii="Calibri" w:hAnsi="Calibri" w:cs="Calibri"/>
-          <w:color w:val="1B1A18"/>
-          <w:sz w:val="22"/>
-        </w:rPr>
-        <w:t>Course materials and lecture framing. African Urban Worship Music. Yale Divinity School.</w:t>
-      </w:r>
-    </w:p>
-    <w:p>
-      <w:pPr>
-        <w:pStyle w:val="ListNumber"/>
-      </w:pPr>
-      <w:r>
-        <w:rPr>
-          <w:rFonts w:ascii="Calibri" w:hAnsi="Calibri" w:cs="Calibri"/>
-          <w:color w:val="1B1A18"/>
-          <w:sz w:val="22"/>
-        </w:rPr>
-        <w:t>King, Roberta Rose, Jean Ngoya Kidula, James R. Krabill, and Thomas Oduro. Music in the Life of the African Church. Waco, TX: Baylor University Press, 2008.</w:t>
       </w:r>
     </w:p>
     <w:p>

</xml_diff>